<commit_message>
docs: add businsess roles
</commit_message>
<xml_diff>
--- a/Entities_and_Business_Rules.docx
+++ b/Entities_and_Business_Rules.docx
@@ -7,7 +7,7 @@
         <w:pStyle w:val="Heading1"/>
       </w:pPr>
       <w:r>
-        <w:t>Entities and Business Rules</w:t>
+        <w:t>Entities, Business Rules, and Roles</w:t>
       </w:r>
     </w:p>
     <w:p>
@@ -18,34 +18,63 @@
         <w:t>Entities</w:t>
       </w:r>
     </w:p>
+    <w:p/>
     <w:p>
       <w:r>
         <w:t>Student (with property is_admin)</w:t>
-        <w:br/>
-        <w:br/>
+      </w:r>
+    </w:p>
+    <w:p/>
+    <w:p>
+      <w:r>
         <w:t>Cohort_Enrollment (Student enrolls a certain cohort)</w:t>
-        <w:br/>
-        <w:t>Class_Group_Follow (Student follows a certain class group)</w:t>
-        <w:br/>
-        <w:br/>
+      </w:r>
+    </w:p>
+    <w:p>
+      <w:r>
+        <w:t>Course_Group_Follow (Student follows a certain course group)</w:t>
+      </w:r>
+    </w:p>
+    <w:p/>
+    <w:p>
+      <w:r>
         <w:t>Cohort</w:t>
-        <w:br/>
+      </w:r>
+    </w:p>
+    <w:p>
+      <w:r>
         <w:t>Course</w:t>
-        <w:br/>
-        <w:br/>
+      </w:r>
+    </w:p>
+    <w:p/>
+    <w:p>
+      <w:r>
         <w:t>Cohort_Course_Relation (Course inside a certain cohort)</w:t>
-        <w:br/>
-        <w:t>Class_Group</w:t>
-        <w:br/>
-        <w:br/>
+      </w:r>
+    </w:p>
+    <w:p>
+      <w:r>
+        <w:t>Course_Group</w:t>
+      </w:r>
+    </w:p>
+    <w:p/>
+    <w:p>
+      <w:r>
         <w:t>Deliverables</w:t>
-        <w:br/>
-        <w:br/>
+      </w:r>
+    </w:p>
+    <w:p/>
+    <w:p>
+      <w:r>
         <w:t>Notification</w:t>
-        <w:br/>
+      </w:r>
+    </w:p>
+    <w:p>
+      <w:r>
         <w:t>Student_Notification (student status of each notification)</w:t>
       </w:r>
     </w:p>
+    <w:p/>
     <w:p>
       <w:pPr>
         <w:pStyle w:val="Heading2"/>
@@ -54,150 +83,450 @@
         <w:t>Business Rules</w:t>
       </w:r>
     </w:p>
+    <w:p/>
     <w:p>
       <w:r>
         <w:t>Student</w:t>
-        <w:br/>
-        <w:t>- A student is uniquely identified by their email address.</w:t>
-        <w:br/>
-        <w:t>- A student has a name and an email address.</w:t>
-        <w:br/>
-        <w:t>- A student has an is_admin attribute indicating whether they have administrator privileges.</w:t>
-        <w:br/>
-        <w:t>- A student may enroll in zero or many cohorts.</w:t>
-        <w:br/>
-        <w:t>- A student may follow zero or many class groups.</w:t>
-        <w:br/>
-        <w:t>- A student may receive zero or many notifications.</w:t>
-        <w:br/>
-        <w:br/>
+      </w:r>
+    </w:p>
+    <w:p>
+      <w:r>
+        <w:t>A student is uniquely identified by their email address.</w:t>
+      </w:r>
+    </w:p>
+    <w:p>
+      <w:r>
+        <w:t>A student has a name and an email address.</w:t>
+      </w:r>
+    </w:p>
+    <w:p>
+      <w:r>
+        <w:t>A student has an is_admin attribute indicating whether they have administrator privileges.</w:t>
+      </w:r>
+    </w:p>
+    <w:p>
+      <w:r>
+        <w:t>A student may enroll in zero or many cohorts.</w:t>
+      </w:r>
+    </w:p>
+    <w:p>
+      <w:r>
+        <w:t>A student may follow zero or many course groups.</w:t>
+      </w:r>
+    </w:p>
+    <w:p>
+      <w:r>
+        <w:t>A student may receive zero or many notifications.</w:t>
+      </w:r>
+    </w:p>
+    <w:p/>
+    <w:p>
+      <w:r>
         <w:t>Cohort</w:t>
-        <w:br/>
-        <w:t>- A cohort has a unique identifier.</w:t>
-        <w:br/>
-        <w:t>- A cohort has a name.</w:t>
-        <w:br/>
-        <w:t>- A cohort may contain zero or many courses.</w:t>
-        <w:br/>
-        <w:t>- A cohort may have zero or many enrolled students.</w:t>
-        <w:br/>
-        <w:br/>
+      </w:r>
+    </w:p>
+    <w:p>
+      <w:r>
+        <w:t>A cohort has a unique identifier.</w:t>
+      </w:r>
+    </w:p>
+    <w:p>
+      <w:r>
+        <w:t>A cohort has a name.</w:t>
+      </w:r>
+    </w:p>
+    <w:p>
+      <w:r>
+        <w:t>A cohort may contain zero or many courses.</w:t>
+      </w:r>
+    </w:p>
+    <w:p>
+      <w:r>
+        <w:t>A cohort may have zero or many enrolled students.</w:t>
+      </w:r>
+    </w:p>
+    <w:p/>
+    <w:p>
+      <w:r>
         <w:t>Course</w:t>
-        <w:br/>
-        <w:t>- A course has a unique identifier.</w:t>
-        <w:br/>
-        <w:t>- A course has a name.</w:t>
-        <w:br/>
-        <w:t>- A course may belong to zero or many cohorts.</w:t>
-        <w:br/>
-        <w:t>- A course may have one or many class groups.</w:t>
-        <w:br/>
-        <w:br/>
-        <w:t>Class Group</w:t>
-        <w:br/>
-        <w:t>- A class group has a unique identifier.</w:t>
-        <w:br/>
-        <w:t>- A class group has a name or code (e.g., Group A, Section 1).</w:t>
-        <w:br/>
-        <w:t>- Every class group belongs to exactly one course.</w:t>
-        <w:br/>
-        <w:t>- A class group may contain zero or many deliverables.</w:t>
-        <w:br/>
-        <w:t>- A class group may be followed by zero or many students.</w:t>
-        <w:br/>
-        <w:br/>
+      </w:r>
+    </w:p>
+    <w:p>
+      <w:r>
+        <w:t>A course has a unique identifier.</w:t>
+      </w:r>
+    </w:p>
+    <w:p>
+      <w:r>
+        <w:t>A course has a name.</w:t>
+      </w:r>
+    </w:p>
+    <w:p>
+      <w:r>
+        <w:t>A course may belong to zero or many cohorts.</w:t>
+      </w:r>
+    </w:p>
+    <w:p>
+      <w:r>
+        <w:t>A course may have one or many course groups.</w:t>
+      </w:r>
+    </w:p>
+    <w:p/>
+    <w:p>
+      <w:r>
+        <w:t>Course Group</w:t>
+      </w:r>
+    </w:p>
+    <w:p>
+      <w:r>
+        <w:t>A course group has a unique identifier.</w:t>
+      </w:r>
+    </w:p>
+    <w:p>
+      <w:r>
+        <w:t>A course group has a name or code (e.g., Group A, Section 1).</w:t>
+      </w:r>
+    </w:p>
+    <w:p>
+      <w:r>
+        <w:t>Every course group belongs to exactly one course.</w:t>
+      </w:r>
+    </w:p>
+    <w:p>
+      <w:r>
+        <w:t>A course group may contain zero or many deliverables.</w:t>
+      </w:r>
+    </w:p>
+    <w:p>
+      <w:r>
+        <w:t>A course group may be followed by zero or many students.</w:t>
+      </w:r>
+    </w:p>
+    <w:p/>
+    <w:p>
+      <w:r>
         <w:t>Deliverable</w:t>
-        <w:br/>
-        <w:t>- A deliverable has a unique identifier.</w:t>
-        <w:br/>
-        <w:t>- A deliverable has a name.</w:t>
-        <w:br/>
-        <w:t>- A deliverable has a deadline.</w:t>
-        <w:br/>
-        <w:t>- Every deliverable belongs to exactly one class group.</w:t>
-        <w:br/>
-        <w:t>- A class group may contain zero or many deliverables.</w:t>
-        <w:br/>
-        <w:br/>
+      </w:r>
+    </w:p>
+    <w:p>
+      <w:r>
+        <w:t>A deliverable has a unique identifier.</w:t>
+      </w:r>
+    </w:p>
+    <w:p>
+      <w:r>
+        <w:t>A deliverable has a name.</w:t>
+      </w:r>
+    </w:p>
+    <w:p>
+      <w:r>
+        <w:t>A deliverable has a deadline.</w:t>
+      </w:r>
+    </w:p>
+    <w:p>
+      <w:r>
+        <w:t>Every deliverable belongs to exactly one course group.</w:t>
+      </w:r>
+    </w:p>
+    <w:p>
+      <w:r>
+        <w:t>A course group may contain zero or many deliverables.</w:t>
+      </w:r>
+    </w:p>
+    <w:p/>
+    <w:p>
+      <w:r>
         <w:t>Notification</w:t>
-        <w:br/>
-        <w:t>- A notification has a unique identifier.</w:t>
-        <w:br/>
-        <w:t>- A notification contains a title or message.</w:t>
-        <w:br/>
-        <w:t>- A notification has a creation timestamp.</w:t>
-        <w:br/>
-        <w:t>- A notification is generated for a specific event or deliverable.</w:t>
-        <w:br/>
-        <w:t>- A notification may be sent to one or many students.</w:t>
-        <w:br/>
-        <w:br/>
+      </w:r>
+    </w:p>
+    <w:p>
+      <w:r>
+        <w:t>A notification has a unique identifier.</w:t>
+      </w:r>
+    </w:p>
+    <w:p>
+      <w:r>
+        <w:t>A notification contains a title or message.</w:t>
+      </w:r>
+    </w:p>
+    <w:p>
+      <w:r>
+        <w:t>A notification has a creation timestamp.</w:t>
+      </w:r>
+    </w:p>
+    <w:p>
+      <w:r>
+        <w:t>A notification is generated for a specific event or deliverable.</w:t>
+      </w:r>
+    </w:p>
+    <w:p>
+      <w:r>
+        <w:t>A notification may be sent to one or many students.</w:t>
+      </w:r>
+    </w:p>
+    <w:p/>
+    <w:p>
+      <w:r>
         <w:t>Relationship Business Rules</w:t>
-        <w:br/>
-        <w:br/>
+      </w:r>
+    </w:p>
+    <w:p>
+      <w:r>
         <w:t>Cohort_Enrollment (Student ↔ Cohort)</w:t>
-        <w:br/>
-        <w:t>- A student may enroll in zero or many cohorts.</w:t>
-        <w:br/>
-        <w:t>- A cohort may have zero or many enrolled students.</w:t>
-        <w:br/>
-        <w:t>- A student cannot be enrolled in the same cohort more than once.</w:t>
-        <w:br/>
-        <w:t>- Cardinality: Many-to-Many (M:N)</w:t>
-        <w:br/>
-        <w:br/>
+      </w:r>
+    </w:p>
+    <w:p>
+      <w:r>
+        <w:t>A student may enroll in zero or many cohorts.</w:t>
+      </w:r>
+    </w:p>
+    <w:p>
+      <w:r>
+        <w:t>A cohort may have zero or many enrolled students.</w:t>
+      </w:r>
+    </w:p>
+    <w:p>
+      <w:r>
+        <w:t>A student cannot be enrolled in the same cohort more than once.</w:t>
+      </w:r>
+    </w:p>
+    <w:p/>
+    <w:p>
+      <w:r>
+        <w:t>Cardinality: Many-to-Many (M:N)</w:t>
+      </w:r>
+    </w:p>
+    <w:p/>
+    <w:p>
+      <w:r>
         <w:t>Cohort_Course_Relation (Cohort ↔ Course)</w:t>
-        <w:br/>
-        <w:t>- A cohort may contain zero or many courses.</w:t>
-        <w:br/>
-        <w:t>- A course may belong to zero or many cohorts.</w:t>
-        <w:br/>
-        <w:t>- A cohort cannot contain the same course more than once.</w:t>
-        <w:br/>
-        <w:t>- Cardinality: Many-to-Many (M:N)</w:t>
-        <w:br/>
-        <w:br/>
-        <w:t>Class_Group_Follow (Student ↔ Class Group)</w:t>
-        <w:br/>
-        <w:t>- A student may follow zero or many class groups.</w:t>
-        <w:br/>
-        <w:t>- A class group may be followed by zero or many students.</w:t>
-        <w:br/>
-        <w:t>- A student cannot follow the same class group more than once.</w:t>
-        <w:br/>
-        <w:t>- Cardinality: Many-to-Many (M:N)</w:t>
-        <w:br/>
-        <w:br/>
+      </w:r>
+    </w:p>
+    <w:p>
+      <w:r>
+        <w:t>A cohort may contain zero or many courses.</w:t>
+      </w:r>
+    </w:p>
+    <w:p>
+      <w:r>
+        <w:t>A course may belong to zero or many cohorts.</w:t>
+      </w:r>
+    </w:p>
+    <w:p>
+      <w:r>
+        <w:t>A cohort cannot contain the same course more than once.</w:t>
+      </w:r>
+    </w:p>
+    <w:p/>
+    <w:p>
+      <w:r>
+        <w:t>Cardinality: Many-to-Many (M:N)</w:t>
+      </w:r>
+    </w:p>
+    <w:p/>
+    <w:p>
+      <w:r>
+        <w:t>Course_Group_Follow (Student ↔ Course Group)</w:t>
+      </w:r>
+    </w:p>
+    <w:p>
+      <w:r>
+        <w:t>A student may follow zero or many course groups.</w:t>
+      </w:r>
+    </w:p>
+    <w:p>
+      <w:r>
+        <w:t>A course group may be followed by zero or many students.</w:t>
+      </w:r>
+    </w:p>
+    <w:p>
+      <w:r>
+        <w:t>A student cannot follow the same course group more than once.</w:t>
+      </w:r>
+    </w:p>
+    <w:p/>
+    <w:p>
+      <w:r>
+        <w:t>Cardinality: Many-to-Many (M:N)</w:t>
+      </w:r>
+    </w:p>
+    <w:p/>
+    <w:p>
+      <w:r>
         <w:t>Student_Notification (Student ↔ Notification)</w:t>
-        <w:br/>
-        <w:t>- A student may receive zero or many notifications.</w:t>
-        <w:br/>
-        <w:t>- A notification may be associated with one or many students.</w:t>
-        <w:br/>
-        <w:t>- Each student-notification record stores the student's notification status (e.g., read or unread).</w:t>
-        <w:br/>
-        <w:t>- A student cannot have duplicate records for the same notification.</w:t>
-        <w:br/>
-        <w:t>- Cardinality: Many-to-Many (M:N)</w:t>
-        <w:br/>
-        <w:br/>
-        <w:t>Course → Class Group</w:t>
-        <w:br/>
-        <w:t>- A course may have one or many class groups.</w:t>
-        <w:br/>
-        <w:t>- Every class group belongs to exactly one course.</w:t>
-        <w:br/>
-        <w:t>- Cardinality: One-to-Many (1:N)</w:t>
-        <w:br/>
-        <w:br/>
-        <w:t>Class Group → Deliverable</w:t>
-        <w:br/>
-        <w:t>- A class group may contain zero or many deliverables.</w:t>
-        <w:br/>
-        <w:t>- Every deliverable belongs to exactly one class group.</w:t>
-        <w:br/>
-        <w:t>- Cardinality: One-to-Many (1:N)</w:t>
-        <w:br/>
+      </w:r>
+    </w:p>
+    <w:p>
+      <w:r>
+        <w:t>A student may receive zero or many notifications.</w:t>
+      </w:r>
+    </w:p>
+    <w:p>
+      <w:r>
+        <w:t>A notification may be associated with one or many students.</w:t>
+      </w:r>
+    </w:p>
+    <w:p>
+      <w:r>
+        <w:t>Each student-notification record stores the student's notification status (e.g., read or unread).</w:t>
+      </w:r>
+    </w:p>
+    <w:p>
+      <w:r>
+        <w:t>A student cannot have duplicate records for the same notification.</w:t>
+      </w:r>
+    </w:p>
+    <w:p/>
+    <w:p>
+      <w:r>
+        <w:t>Cardinality: Many-to-Many (M:N)</w:t>
+      </w:r>
+    </w:p>
+    <w:p/>
+    <w:p>
+      <w:r>
+        <w:t>Course → Course Group</w:t>
+      </w:r>
+    </w:p>
+    <w:p>
+      <w:r>
+        <w:t>A course may have one or many course groups.</w:t>
+      </w:r>
+    </w:p>
+    <w:p>
+      <w:r>
+        <w:t>Every course group belongs to exactly one course.</w:t>
+      </w:r>
+    </w:p>
+    <w:p/>
+    <w:p>
+      <w:r>
+        <w:t>Cardinality: One-to-Many (1:N)</w:t>
+      </w:r>
+    </w:p>
+    <w:p/>
+    <w:p>
+      <w:r>
+        <w:t>Course Group → Deliverable</w:t>
+      </w:r>
+    </w:p>
+    <w:p>
+      <w:r>
+        <w:t>A course group may contain zero or many deliverables.</w:t>
+      </w:r>
+    </w:p>
+    <w:p>
+      <w:r>
+        <w:t>Every deliverable belongs to exactly one course group.</w:t>
+      </w:r>
+    </w:p>
+    <w:p/>
+    <w:p>
+      <w:r>
+        <w:t>Cardinality: One-to-Many (1:N)</w:t>
+      </w:r>
+    </w:p>
+    <w:p/>
+    <w:p>
+      <w:pPr>
+        <w:pStyle w:val="Heading2"/>
+      </w:pPr>
+      <w:r>
+        <w:t>Roles</w:t>
+      </w:r>
+    </w:p>
+    <w:p/>
+    <w:p>
+      <w:pPr>
+        <w:pStyle w:val="Heading3"/>
+      </w:pPr>
+      <w:r>
+        <w:t>Normal Student</w:t>
+      </w:r>
+    </w:p>
+    <w:p>
+      <w:r>
+        <w:t>A normal student (is_admin = false) can:</w:t>
+      </w:r>
+    </w:p>
+    <w:p>
+      <w:r>
+        <w:t>- Enroll in available cohorts.</w:t>
+      </w:r>
+    </w:p>
+    <w:p>
+      <w:r>
+        <w:t>- Follow course groups within the courses they are enrolled in.</w:t>
+      </w:r>
+    </w:p>
+    <w:p>
+      <w:r>
+        <w:t>- View deliverables associated with the course groups they follow.</w:t>
+      </w:r>
+    </w:p>
+    <w:p>
+      <w:r>
+        <w:t>- Receive notifications related to their followed course groups, courses, or cohorts.</w:t>
+      </w:r>
+    </w:p>
+    <w:p>
+      <w:r>
+        <w:t>- Mark their own notifications as read or unread.</w:t>
+      </w:r>
+    </w:p>
+    <w:p/>
+    <w:p>
+      <w:r>
+        <w:t>A normal student cannot:</w:t>
+      </w:r>
+    </w:p>
+    <w:p>
+      <w:r>
+        <w:t>- Create, update, or delete cohorts, courses, course groups, or deliverables.</w:t>
+      </w:r>
+    </w:p>
+    <w:p>
+      <w:r>
+        <w:t>- Send notifications to other students.</w:t>
+      </w:r>
+    </w:p>
+    <w:p/>
+    <w:p>
+      <w:pPr>
+        <w:pStyle w:val="Heading3"/>
+      </w:pPr>
+      <w:r>
+        <w:t>Admin Student</w:t>
+      </w:r>
+    </w:p>
+    <w:p>
+      <w:r>
+        <w:t>An admin student (is_admin = true) can perform all normal student actions, plus:</w:t>
+      </w:r>
+    </w:p>
+    <w:p>
+      <w:r>
+        <w:t>- Create, update, and delete cohorts.</w:t>
+      </w:r>
+    </w:p>
+    <w:p>
+      <w:r>
+        <w:t>- Create, update, and delete courses.</w:t>
+      </w:r>
+    </w:p>
+    <w:p>
+      <w:r>
+        <w:t>- Create, update, and delete course groups.</w:t>
+      </w:r>
+    </w:p>
+    <w:p>
+      <w:r>
+        <w:t>- Create, update, and delete deliverables.</w:t>
+      </w:r>
+    </w:p>
+    <w:p>
+      <w:r>
+        <w:t>- Create and send notifications to an entire course group, an entire cohort, or an entire course.</w:t>
       </w:r>
     </w:p>
     <w:sectPr>
@@ -574,6 +903,7 @@
     <w:qFormat/>
     <w:rsid w:val="00FC693F"/>
     <w:rPr>
+      <w:rFonts w:ascii="Calibri" w:hAnsi="Calibri"/>
       <w:sz w:val="22"/>
     </w:rPr>
   </w:style>

</xml_diff>

<commit_message>
docs: update entities names and add foreign keys
</commit_message>
<xml_diff>
--- a/Entities_and_Business_Rules.docx
+++ b/Entities_and_Business_Rules.docx
@@ -11,82 +11,76 @@
       </w:r>
     </w:p>
     <w:p>
-      <w:pPr>
-        <w:pStyle w:val="Heading2"/>
-      </w:pPr>
       <w:r>
-        <w:t>Entities</w:t>
+        <w:t># Entities</w:t>
       </w:r>
     </w:p>
     <w:p/>
     <w:p>
       <w:r>
-        <w:t>Student (with property is_admin)</w:t>
+        <w:t>STUDENTS (with property is_admin)</w:t>
       </w:r>
     </w:p>
     <w:p/>
     <w:p>
       <w:r>
-        <w:t>Cohort_Enrollment (Student enrolls a certain cohort)</w:t>
+        <w:t>STUDENTS_COHORTS (student_id, cohort_id)</w:t>
       </w:r>
     </w:p>
     <w:p>
       <w:r>
-        <w:t>Course_Group_Follow (Student follows a certain course group)</w:t>
+        <w:t>STUDENTS_COURSE_GROUPS (student_id, course_group_id)</w:t>
       </w:r>
     </w:p>
     <w:p/>
     <w:p>
       <w:r>
-        <w:t>Cohort</w:t>
+        <w:t>COHORTS</w:t>
       </w:r>
     </w:p>
     <w:p>
       <w:r>
-        <w:t>Course</w:t>
+        <w:t>COURSES</w:t>
       </w:r>
     </w:p>
     <w:p/>
     <w:p>
       <w:r>
-        <w:t>Cohort_Course_Relation (Course inside a certain cohort)</w:t>
+        <w:t>COHORTS_COURSES (cohort_id, course_id)</w:t>
       </w:r>
     </w:p>
     <w:p>
       <w:r>
-        <w:t>Course_Group</w:t>
+        <w:t>COURSE_GROUPS (course_id)</w:t>
       </w:r>
     </w:p>
     <w:p/>
     <w:p>
       <w:r>
-        <w:t>Deliverables</w:t>
+        <w:t>DELIVERABLES (course_group_id)</w:t>
       </w:r>
     </w:p>
     <w:p/>
     <w:p>
       <w:r>
-        <w:t>Notification</w:t>
+        <w:t>NOTIFICATIONS (deliverable_id (optional), course_id (optional))</w:t>
       </w:r>
     </w:p>
     <w:p>
       <w:r>
-        <w:t>Student_Notification (student status of each notification)</w:t>
-      </w:r>
-    </w:p>
-    <w:p/>
-    <w:p>
-      <w:pPr>
-        <w:pStyle w:val="Heading2"/>
-      </w:pPr>
-      <w:r>
-        <w:t>Business Rules</w:t>
+        <w:t>STUDENTS_NOTIFICATIONS (student_id, notification_id)</w:t>
       </w:r>
     </w:p>
     <w:p/>
     <w:p>
       <w:r>
-        <w:t>Student</w:t>
+        <w:t># Business Rules</w:t>
+      </w:r>
+    </w:p>
+    <w:p/>
+    <w:p>
+      <w:r>
+        <w:t>STUDENTS</w:t>
       </w:r>
     </w:p>
     <w:p>
@@ -122,7 +116,7 @@
     <w:p/>
     <w:p>
       <w:r>
-        <w:t>Cohort</w:t>
+        <w:t>COHORTS</w:t>
       </w:r>
     </w:p>
     <w:p>
@@ -148,7 +142,7 @@
     <w:p/>
     <w:p>
       <w:r>
-        <w:t>Course</w:t>
+        <w:t>COURSES</w:t>
       </w:r>
     </w:p>
     <w:p>
@@ -174,7 +168,7 @@
     <w:p/>
     <w:p>
       <w:r>
-        <w:t>Course Group</w:t>
+        <w:t>COURSE_GROUPS</w:t>
       </w:r>
     </w:p>
     <w:p>
@@ -205,7 +199,7 @@
     <w:p/>
     <w:p>
       <w:r>
-        <w:t>Deliverable</w:t>
+        <w:t>DELIVERABLES</w:t>
       </w:r>
     </w:p>
     <w:p>
@@ -236,7 +230,7 @@
     <w:p/>
     <w:p>
       <w:r>
-        <w:t>Notification</w:t>
+        <w:t>NOTIFICATIONS</w:t>
       </w:r>
     </w:p>
     <w:p>
@@ -272,7 +266,7 @@
     </w:p>
     <w:p>
       <w:r>
-        <w:t>Cohort_Enrollment (Student ↔ Cohort)</w:t>
+        <w:t>STUDENTS_COHORTS (STUDENTS ↔ COHORTS)</w:t>
       </w:r>
     </w:p>
     <w:p>
@@ -299,7 +293,7 @@
     <w:p/>
     <w:p>
       <w:r>
-        <w:t>Cohort_Course_Relation (Cohort ↔ Course)</w:t>
+        <w:t>COHORTS_COURSES (COHORTS ↔ COURSES)</w:t>
       </w:r>
     </w:p>
     <w:p>
@@ -326,7 +320,7 @@
     <w:p/>
     <w:p>
       <w:r>
-        <w:t>Course_Group_Follow (Student ↔ Course Group)</w:t>
+        <w:t>STUDENTS_COURSE_GROUPS (STUDENTS ↔ COURSE_GROUPS)</w:t>
       </w:r>
     </w:p>
     <w:p>
@@ -353,7 +347,7 @@
     <w:p/>
     <w:p>
       <w:r>
-        <w:t>Student_Notification (Student ↔ Notification)</w:t>
+        <w:t>STUDENTS_NOTIFICATIONS (STUDENTS ↔ NOTIFICATIONS)</w:t>
       </w:r>
     </w:p>
     <w:p>
@@ -385,7 +379,7 @@
     <w:p/>
     <w:p>
       <w:r>
-        <w:t>Course → Course Group</w:t>
+        <w:t>COURSES → COURSE_GROUPS</w:t>
       </w:r>
     </w:p>
     <w:p>
@@ -407,7 +401,7 @@
     <w:p/>
     <w:p>
       <w:r>
-        <w:t>Course Group → Deliverable</w:t>
+        <w:t>COURSE_GROUPS → DELIVERABLES</w:t>
       </w:r>
     </w:p>
     <w:p>
@@ -428,20 +422,14 @@
     </w:p>
     <w:p/>
     <w:p>
-      <w:pPr>
-        <w:pStyle w:val="Heading2"/>
-      </w:pPr>
       <w:r>
-        <w:t>Roles</w:t>
+        <w:t># Roles</w:t>
       </w:r>
     </w:p>
     <w:p/>
     <w:p>
-      <w:pPr>
-        <w:pStyle w:val="Heading3"/>
-      </w:pPr>
       <w:r>
-        <w:t>Normal Student</w:t>
+        <w:t>## Normal Student</w:t>
       </w:r>
     </w:p>
     <w:p>
@@ -492,11 +480,8 @@
     </w:p>
     <w:p/>
     <w:p>
-      <w:pPr>
-        <w:pStyle w:val="Heading3"/>
-      </w:pPr>
       <w:r>
-        <w:t>Admin Student</w:t>
+        <w:t>## Admin Student</w:t>
       </w:r>
     </w:p>
     <w:p>

</xml_diff>